<commit_message>
Updated the AVCDL primary document (incorrect RACI information for threat modeling review) / Updated the AVCDL roles and responsibilities spreadsheet (incorrect RACI information for threat modeling / threat modeling review) / neglected to push the source changes for the previous change to the primary document
</commit_message>
<xml_diff>
--- a/source/reference_documents/secondary_documents/design phase/Threat Modeling Report/Threat Modeling Report.docx
+++ b/source/reference_documents/secondary_documents/design phase/Threat Modeling Report/Threat Modeling Report.docx
@@ -25,7 +25,10 @@
         <w:t xml:space="preserve">Version </w:t>
       </w:r>
       <w:r>
-        <w:t>10</w:t>
+        <w:t>1</w:t>
+      </w:r>
+      <w:r>
+        <w:t>1</w:t>
       </w:r>
     </w:p>
     <w:p>
@@ -42,7 +45,7 @@
         <w:rPr>
           <w:noProof/>
         </w:rPr>
-        <w:t>4/11/25 1:01 PM</w:t>
+        <w:t>3/27/26 1:44 PM</w:t>
       </w:r>
       <w:r>
         <w:fldChar w:fldCharType="end"/>
@@ -152,39 +155,11 @@
       </w:r>
     </w:p>
     <w:p>
-      <w:r>
-        <w:t xml:space="preserve">This document is motivated by the need to determine whether the element’s design has security deficiencies. This is necessary given the nature of safety-critical, cyber-physical systems, subject to certifications such as </w:t>
-      </w:r>
-      <w:r>
-        <w:rPr>
-          <w:b/>
-          <w:bCs/>
-        </w:rPr>
-        <w:t>ISO</w:t>
-      </w:r>
-      <w:r>
-        <w:rPr>
-          <w:b/>
-          <w:bCs/>
-        </w:rPr>
-        <w:t>/SAE</w:t>
-      </w:r>
-      <w:r>
-        <w:rPr>
-          <w:b/>
-          <w:bCs/>
-        </w:rPr>
-        <w:t xml:space="preserve"> 21434</w:t>
-      </w:r>
-      <w:r>
-        <w:t xml:space="preserve"> and </w:t>
-      </w:r>
-      <w:r>
-        <w:rPr>
-          <w:b/>
-          <w:bCs/>
-        </w:rPr>
-        <w:t>ISO 26262</w:t>
+      <w:pPr>
+        <w:spacing w:after="240"/>
+      </w:pPr>
+      <w:r>
+        <w:t>This document is motivated by the need to determine whether the element’s design has security deficiencies. This is necessary given the nature of safety-critical, cyber-physical systems, subject to certifications</w:t>
       </w:r>
       <w:r>
         <w:t>.</w:t>
@@ -192,11 +167,94 @@
     </w:p>
     <w:p>
       <w:pPr>
-        <w:pStyle w:val="Heading1"/>
+        <w:pStyle w:val="Note"/>
       </w:pPr>
       <w:bookmarkStart w:id="3" w:name="_f5diy2ktdyyf" w:colFirst="0" w:colLast="0"/>
       <w:bookmarkEnd w:id="3"/>
       <w:r>
+        <w:rPr>
+          <w:b/>
+          <w:bCs/>
+          <w:color w:val="0070C0"/>
+        </w:rPr>
+        <w:t>Note:</w:t>
+      </w:r>
+      <w:r>
+        <w:tab/>
+        <w:t xml:space="preserve">Within the </w:t>
+      </w:r>
+      <w:r>
+        <w:t>context</w:t>
+      </w:r>
+      <w:r>
+        <w:t xml:space="preserve"> of this document, the terms </w:t>
+      </w:r>
+      <w:r>
+        <w:rPr>
+          <w:b/>
+          <w:bCs/>
+          <w:i/>
+          <w:iCs/>
+        </w:rPr>
+        <w:t>security</w:t>
+      </w:r>
+      <w:r>
+        <w:t xml:space="preserve"> and </w:t>
+      </w:r>
+      <w:r>
+        <w:rPr>
+          <w:b/>
+          <w:bCs/>
+          <w:i/>
+          <w:iCs/>
+        </w:rPr>
+        <w:t>cybersecurity</w:t>
+      </w:r>
+      <w:r>
+        <w:t xml:space="preserve"> are used interchangeably. It is presumed that the term </w:t>
+      </w:r>
+      <w:r>
+        <w:rPr>
+          <w:b/>
+          <w:bCs/>
+          <w:i/>
+          <w:iCs/>
+        </w:rPr>
+        <w:t>security</w:t>
+      </w:r>
+      <w:r>
+        <w:t xml:space="preserve"> is being used in reference to </w:t>
+      </w:r>
+      <w:r>
+        <w:rPr>
+          <w:b/>
+          <w:bCs/>
+          <w:i/>
+          <w:iCs/>
+        </w:rPr>
+        <w:t>cybersecurity</w:t>
+      </w:r>
+      <w:r>
+        <w:t xml:space="preserve"> and not </w:t>
+      </w:r>
+      <w:r>
+        <w:rPr>
+          <w:b/>
+          <w:bCs/>
+          <w:i/>
+          <w:iCs/>
+        </w:rPr>
+        <w:t>physical security</w:t>
+      </w:r>
+      <w:r>
+        <w:t>.</w:t>
+      </w:r>
+    </w:p>
+    <w:p>
+      <w:pPr>
+        <w:pStyle w:val="Heading1"/>
+      </w:pPr>
+      <w:r>
         <w:t>License</w:t>
       </w:r>
     </w:p>
@@ -211,7 +269,19 @@
         <w:rPr>
           <w:lang w:val="en-US"/>
         </w:rPr>
-        <w:t xml:space="preserve">was created by </w:t>
+        <w:t xml:space="preserve">was </w:t>
+      </w:r>
+      <w:r>
+        <w:rPr>
+          <w:lang w:val="en-US"/>
+        </w:rPr>
+        <w:t xml:space="preserve">originally </w:t>
+      </w:r>
+      <w:r>
+        <w:rPr>
+          <w:lang w:val="en-US"/>
+        </w:rPr>
+        <w:t xml:space="preserve">created by </w:t>
       </w:r>
       <w:r>
         <w:rPr>
@@ -1044,7 +1114,6 @@
         <w:tc>
           <w:tcPr>
             <w:tcW w:w="1520" w:type="dxa"/>
-            <w:shd w:val="clear" w:color="auto" w:fill="auto"/>
             <w:tcMar>
               <w:top w:w="100" w:type="dxa"/>
               <w:left w:w="100" w:type="dxa"/>
@@ -1082,7 +1151,6 @@
         <w:tc>
           <w:tcPr>
             <w:tcW w:w="2520" w:type="dxa"/>
-            <w:shd w:val="clear" w:color="auto" w:fill="auto"/>
             <w:tcMar>
               <w:top w:w="100" w:type="dxa"/>
               <w:left w:w="100" w:type="dxa"/>
@@ -1112,7 +1180,6 @@
         <w:tc>
           <w:tcPr>
             <w:tcW w:w="1520" w:type="dxa"/>
-            <w:shd w:val="clear" w:color="auto" w:fill="auto"/>
             <w:tcMar>
               <w:top w:w="100" w:type="dxa"/>
               <w:left w:w="100" w:type="dxa"/>
@@ -1150,7 +1217,6 @@
         <w:tc>
           <w:tcPr>
             <w:tcW w:w="2520" w:type="dxa"/>
-            <w:shd w:val="clear" w:color="auto" w:fill="auto"/>
             <w:tcMar>
               <w:top w:w="100" w:type="dxa"/>
               <w:left w:w="100" w:type="dxa"/>
@@ -1180,7 +1246,6 @@
         <w:tc>
           <w:tcPr>
             <w:tcW w:w="1520" w:type="dxa"/>
-            <w:shd w:val="clear" w:color="auto" w:fill="auto"/>
             <w:tcMar>
               <w:top w:w="100" w:type="dxa"/>
               <w:left w:w="100" w:type="dxa"/>
@@ -1218,7 +1283,6 @@
         <w:tc>
           <w:tcPr>
             <w:tcW w:w="2520" w:type="dxa"/>
-            <w:shd w:val="clear" w:color="auto" w:fill="auto"/>
             <w:tcMar>
               <w:top w:w="100" w:type="dxa"/>
               <w:left w:w="100" w:type="dxa"/>
@@ -1434,7 +1498,6 @@
         <w:tc>
           <w:tcPr>
             <w:tcW w:w="1520" w:type="dxa"/>
-            <w:shd w:val="clear" w:color="auto" w:fill="auto"/>
             <w:tcMar>
               <w:top w:w="100" w:type="dxa"/>
               <w:left w:w="100" w:type="dxa"/>
@@ -1465,7 +1528,6 @@
         <w:tc>
           <w:tcPr>
             <w:tcW w:w="3780" w:type="dxa"/>
-            <w:shd w:val="clear" w:color="auto" w:fill="auto"/>
             <w:tcMar>
               <w:top w:w="100" w:type="dxa"/>
               <w:left w:w="100" w:type="dxa"/>
@@ -1497,7 +1559,6 @@
         <w:tc>
           <w:tcPr>
             <w:tcW w:w="1520" w:type="dxa"/>
-            <w:shd w:val="clear" w:color="auto" w:fill="auto"/>
             <w:tcMar>
               <w:top w:w="100" w:type="dxa"/>
               <w:left w:w="100" w:type="dxa"/>
@@ -1528,7 +1589,6 @@
         <w:tc>
           <w:tcPr>
             <w:tcW w:w="3780" w:type="dxa"/>
-            <w:shd w:val="clear" w:color="auto" w:fill="auto"/>
             <w:tcMar>
               <w:top w:w="100" w:type="dxa"/>
               <w:left w:w="100" w:type="dxa"/>
@@ -1551,7 +1611,6 @@
         <w:tc>
           <w:tcPr>
             <w:tcW w:w="1520" w:type="dxa"/>
-            <w:shd w:val="clear" w:color="auto" w:fill="auto"/>
             <w:tcMar>
               <w:top w:w="100" w:type="dxa"/>
               <w:left w:w="100" w:type="dxa"/>
@@ -1582,7 +1641,6 @@
         <w:tc>
           <w:tcPr>
             <w:tcW w:w="3780" w:type="dxa"/>
-            <w:shd w:val="clear" w:color="auto" w:fill="auto"/>
             <w:tcMar>
               <w:top w:w="100" w:type="dxa"/>
               <w:left w:w="100" w:type="dxa"/>
@@ -1705,14 +1763,28 @@
           <w:b/>
           <w:bCs/>
         </w:rPr>
-        <w:t>Element</w:t>
-      </w:r>
-      <w:r>
-        <w:rPr>
-          <w:b/>
-          <w:bCs/>
-        </w:rPr>
-        <w:t>-level Security Requirement</w:t>
+        <w:t>Secur</w:t>
+      </w:r>
+      <w:r>
+        <w:rPr>
+          <w:b/>
+          <w:bCs/>
+        </w:rPr>
+        <w:t>e</w:t>
+      </w:r>
+      <w:r>
+        <w:rPr>
+          <w:b/>
+          <w:bCs/>
+        </w:rPr>
+        <w:t xml:space="preserve"> </w:t>
+      </w:r>
+      <w:r>
+        <w:rPr>
+          <w:b/>
+          <w:bCs/>
+        </w:rPr>
+        <w:t>Design</w:t>
       </w:r>
       <w:r>
         <w:t xml:space="preserve"> process </w:t>
@@ -1772,20 +1844,24 @@
     </w:p>
     <w:p>
       <w:pPr>
+        <w:jc w:val="left"/>
+        <w:rPr>
+          <w:sz w:val="32"/>
+          <w:szCs w:val="32"/>
+        </w:rPr>
+      </w:pPr>
+      <w:bookmarkStart w:id="8" w:name="_sel80lfrfmfd" w:colFirst="0" w:colLast="0"/>
+      <w:bookmarkStart w:id="9" w:name="_ukgjr2k3aiz2" w:colFirst="0" w:colLast="0"/>
+      <w:bookmarkEnd w:id="8"/>
+      <w:bookmarkEnd w:id="9"/>
+      <w:r>
+        <w:br w:type="page"/>
+      </w:r>
+    </w:p>
+    <w:p>
+      <w:pPr>
         <w:pStyle w:val="Heading2"/>
       </w:pPr>
-      <w:bookmarkStart w:id="8" w:name="_sel80lfrfmfd" w:colFirst="0" w:colLast="0"/>
-      <w:bookmarkEnd w:id="8"/>
-      <w:r>
-        <w:br w:type="page"/>
-      </w:r>
-    </w:p>
-    <w:p>
-      <w:pPr>
-        <w:pStyle w:val="Heading2"/>
-      </w:pPr>
-      <w:bookmarkStart w:id="9" w:name="_ukgjr2k3aiz2" w:colFirst="0" w:colLast="0"/>
-      <w:bookmarkEnd w:id="9"/>
       <w:r>
         <w:lastRenderedPageBreak/>
         <w:t>Triage</w:t>
@@ -1814,7 +1890,6 @@
         <w:tc>
           <w:tcPr>
             <w:tcW w:w="1520" w:type="dxa"/>
-            <w:shd w:val="clear" w:color="auto" w:fill="auto"/>
             <w:tcMar>
               <w:top w:w="100" w:type="dxa"/>
               <w:left w:w="100" w:type="dxa"/>
@@ -1845,7 +1920,6 @@
         <w:tc>
           <w:tcPr>
             <w:tcW w:w="2880" w:type="dxa"/>
-            <w:shd w:val="clear" w:color="auto" w:fill="auto"/>
             <w:tcMar>
               <w:top w:w="100" w:type="dxa"/>
               <w:left w:w="100" w:type="dxa"/>
@@ -1868,7 +1942,6 @@
         <w:tc>
           <w:tcPr>
             <w:tcW w:w="1520" w:type="dxa"/>
-            <w:shd w:val="clear" w:color="auto" w:fill="auto"/>
             <w:tcMar>
               <w:top w:w="100" w:type="dxa"/>
               <w:left w:w="100" w:type="dxa"/>
@@ -1899,7 +1972,6 @@
         <w:tc>
           <w:tcPr>
             <w:tcW w:w="2880" w:type="dxa"/>
-            <w:shd w:val="clear" w:color="auto" w:fill="auto"/>
             <w:tcMar>
               <w:top w:w="100" w:type="dxa"/>
               <w:left w:w="100" w:type="dxa"/>
@@ -1934,7 +2006,6 @@
         <w:tc>
           <w:tcPr>
             <w:tcW w:w="1520" w:type="dxa"/>
-            <w:shd w:val="clear" w:color="auto" w:fill="auto"/>
             <w:tcMar>
               <w:top w:w="100" w:type="dxa"/>
               <w:left w:w="100" w:type="dxa"/>
@@ -1965,7 +2036,6 @@
         <w:tc>
           <w:tcPr>
             <w:tcW w:w="2880" w:type="dxa"/>
-            <w:shd w:val="clear" w:color="auto" w:fill="auto"/>
             <w:tcMar>
               <w:top w:w="100" w:type="dxa"/>
               <w:left w:w="100" w:type="dxa"/>
@@ -2749,14 +2819,7 @@
           <w:b/>
           <w:bCs/>
         </w:rPr>
-        <w:t>Element</w:t>
-      </w:r>
-      <w:r>
-        <w:rPr>
-          <w:b/>
-          <w:bCs/>
-        </w:rPr>
-        <w:t>-level Security Requirements</w:t>
+        <w:t>Design Showing Security Considerations</w:t>
       </w:r>
       <w:r>
         <w:t xml:space="preserve"> (AVCDL secondary document)</w:t>
@@ -4273,6 +4336,20 @@
     <w:unhideWhenUsed/>
     <w:rsid w:val="00ED6DD2"/>
   </w:style>
+  <w:style w:type="paragraph" w:customStyle="1" w:styleId="Note">
+    <w:name w:val="Note"/>
+    <w:basedOn w:val="Normal"/>
+    <w:qFormat/>
+    <w:rsid w:val="000C3EAD"/>
+    <w:pPr>
+      <w:spacing w:after="240"/>
+      <w:ind w:left="806" w:hanging="806"/>
+    </w:pPr>
+    <w:rPr>
+      <w:rFonts w:eastAsia="Times New Roman"/>
+      <w:lang w:val="en-US"/>
+    </w:rPr>
+  </w:style>
 </w:styles>
 </file>
 

</xml_diff>